<commit_message>
court(md): amicus brief regenerated on the shared model, latex shipped (tier 1 0 failed), still reported (fb-595.54.23)
Co-Authored-By: Claude Opus 5.5 <noreply@anthropic.com>
</commit_message>
<xml_diff>
--- a/courts/fourth-circuit/maryland/state/court-of-appeals/amicus-brief/usage/OUTPUT-amicus-brief.docx
+++ b/courts/fourth-circuit/maryland/state/court-of-appeals/amicus-brief/usage/OUTPUT-amicus-brief.docx
@@ -2421,7 +2421,7 @@
         <w:tab/>
       </w:r>
       <w:r>
-        <w:t xml:space="preserve">32</w:t>
+        <w:t xml:space="preserve">31</w:t>
       </w:r>
     </w:p>
     <w:p>
@@ -2574,7 +2574,7 @@
         <w:tab/>
       </w:r>
       <w:r>
-        <w:t xml:space="preserve">31</w:t>
+        <w:t xml:space="preserve">32</w:t>
       </w:r>
     </w:p>
     <w:p>
@@ -3750,7 +3750,7 @@
         <w:tab/>
       </w:r>
       <w:r>
-        <w:t xml:space="preserve">31</w:t>
+        <w:t xml:space="preserve">32</w:t>
       </w:r>
     </w:p>
     <w:p>
@@ -4036,7 +4036,7 @@
         <w:tab/>
       </w:r>
       <w:r>
-        <w:t xml:space="preserve">31</w:t>
+        <w:t xml:space="preserve">32</w:t>
       </w:r>
     </w:p>
     <w:p>
@@ -4274,7 +4274,7 @@
         <w:tab/>
       </w:r>
       <w:r>
-        <w:t xml:space="preserve">31</w:t>
+        <w:t xml:space="preserve">32</w:t>
       </w:r>
     </w:p>
     <w:p>
@@ -4755,7 +4755,7 @@
         <w:tab/>
       </w:r>
       <w:r>
-        <w:t xml:space="preserve">31</w:t>
+        <w:t xml:space="preserve">32</w:t>
       </w:r>
     </w:p>
     <w:p>
@@ -4947,7 +4947,7 @@
         <w:tab/>
       </w:r>
       <w:r>
-        <w:t xml:space="preserve">31</w:t>
+        <w:t xml:space="preserve">32</w:t>
       </w:r>
     </w:p>
     <w:p>
@@ -5153,7 +5153,7 @@
         <w:tab/>
       </w:r>
       <w:r>
-        <w:t xml:space="preserve">31</w:t>
+        <w:t xml:space="preserve">32</w:t>
       </w:r>
     </w:p>
     <w:p>
@@ -6039,7 +6039,7 @@
         <w:tab/>
       </w:r>
       <w:r>
-        <w:t xml:space="preserve">31</w:t>
+        <w:t xml:space="preserve">32</w:t>
       </w:r>
     </w:p>
     <w:p>
@@ -6126,7 +6126,7 @@
         <w:tab/>
       </w:r>
       <w:r>
-        <w:t xml:space="preserve">31</w:t>
+        <w:t xml:space="preserve">32</w:t>
       </w:r>
     </w:p>
     <w:p>
@@ -9185,13 +9185,7 @@
         <w:pStyle w:val="BodyText"/>
       </w:pPr>
       <w:r>
-        <w:t xml:space="preserve">The CVA is constitutional for three main reasons. First, in lifting the previous time limit on when a sexual abuse suit could “be filed,” Cts. &amp; Jud. Proc. § 5</w:t>
-      </w:r>
-      <w:r>
-        <w:noBreakHyphen/>
-      </w:r>
-      <w:r>
-        <w:t xml:space="preserve">117(b) (2017),</w:t>
+        <w:t xml:space="preserve">The CVA is constitutional for three main reasons. First, in lifting the previous time limit on when a sexual abuse suit could “be filed,” Cts. &amp; Jud. Proc. § 5-⁠117(b) (2017),</w:t>
       </w:r>
       <w:r>
         <w:t xml:space="preserve"> </w:t>
@@ -9317,13 +9311,7 @@
         <w:t xml:space="preserve"> </w:t>
       </w:r>
       <w:r>
-        <w:t xml:space="preserve">Sess., Part F (July 28, 2017). The law provided that, as to claims against direct perpetrators, “an action for damages . . . shall be filed” (1) any time before the victim turned 18 or (2) subject to certain conditions, within 20 years after they turned 18 (i.e., by age 38) or within three years of the date the defendant was convicted of sexual abuse. Cts. &amp; Jud. Proc. § 5</w:t>
-      </w:r>
-      <w:r>
-        <w:noBreakHyphen/>
-      </w:r>
-      <w:r>
-        <w:t xml:space="preserve">117(b) (2017).</w:t>
+        <w:t xml:space="preserve">Sess., Part F (July 28, 2017). The law provided that, as to claims against direct perpetrators, “an action for damages . . . shall be filed” (1) any time before the victim turned 18 or (2) subject to certain conditions, within 20 years after they turned 18 (i.e., by age 38) or within three years of the date the defendant was convicted of sexual abuse. Cts. &amp; Jud. Proc. § 5-⁠117(b) (2017).</w:t>
       </w:r>
       <w:r>
         <w:t xml:space="preserve"> </w:t>
@@ -9345,13 +9333,7 @@
         <w:t xml:space="preserve"> </w:t>
       </w:r>
       <w:r>
-        <w:t xml:space="preserve">§ 5</w:t>
-      </w:r>
-      <w:r>
-        <w:noBreakHyphen/>
-      </w:r>
-      <w:r>
-        <w:t xml:space="preserve">117(d) (providing that an “action for damages” against a non-perpetrator must “be filed” within “20 years after the date on which the victim reaches the age of majority”). The law applied retroactively only to “actions that were barred by the application of the [seven-year] period of limitations applicable before October 1, 2017.” 2017 Md. Laws</w:t>
+        <w:t xml:space="preserve">§ 5-⁠117(d) (providing that an “action for damages” against a non-perpetrator must “be filed” within “20 years after the date on which the victim reaches the age of majority”). The law applied retroactively only to “actions that were barred by the application of the [seven-year] period of limitations applicable before October 1, 2017.” 2017 Md. Laws</w:t>
       </w:r>
       <w:r>
         <w:t xml:space="preserve"> </w:t>
@@ -9365,7 +9347,7 @@
         <w:pStyle w:val="BodyTextNote"/>
       </w:pPr>
       <w:r>
-        <w:t xml:space="preserve">The 2023 CVA was enacted in response to new revelations about the prevalence of child sexual abuse in Maryland and the barriers that prevented victims from getting justice. In 2018, the Attorney General launched an investigation into the “pervasive and persistent [child sexual] abuse by priests” within the Archdiocese of Baltimore and the longstanding efforts to “cover up . . . that abuse.” Md. Att’y Gen., Attorney General’s Report on Child Sexual Abuse in the Archdiocese of Baltimore 1 (Sept. 2023) (“Att’y Gen. Report”).</w:t>
+        <w:t xml:space="preserve">The 2023 CVA was enacted in response to new revelations about the prevalence of child sexual abuse in Maryland and the barriers that prevented victims from getting justice. In 2018, the Attorney General launched an investigation into the “pervasive and persistent [child sexual] abuse by priests” within the Archdiocese of Baltimore and the longstanding efforts to “cover up . . . that abuse.” Md. Att’y Gen., Attorney General’s Report on Child Sexual Abuse in the Archdiocese of Baltimore 1 (Sept. 2023) (“Att’y Gen. Report”).</w:t>
       </w:r>
       <w:r>
         <w:rPr>
@@ -9465,13 +9447,7 @@
         <w:pStyle w:val="BodyText"/>
       </w:pPr>
       <w:r>
-        <w:t xml:space="preserve">The General Assembly passed the CVA in October 2023, soon after the Attorney General released the report of investigation. The Act seeks to provide victims access to justice by lifting the time limits in effect under the 2017 law. It states that claims arising from child sexual abuse may be filed at any time during the victim’s life. Cts. &amp; Jud. Proc. § 5</w:t>
-      </w:r>
-      <w:r>
-        <w:noBreakHyphen/>
-      </w:r>
-      <w:r>
-        <w:t xml:space="preserve">117 (2023).</w:t>
+        <w:t xml:space="preserve">The General Assembly passed the CVA in October 2023, soon after the Attorney General released the report of investigation. The Act seeks to provide victims access to justice by lifting the time limits in effect under the 2017 law. It states that claims arising from child sexual abuse may be filed at any time during the victim’s life. Cts. &amp; Jud. Proc. § 5-⁠117 (2023).</w:t>
       </w:r>
       <w:r>
         <w:t xml:space="preserve"> </w:t>
@@ -10315,24 +10291,18 @@
         <w:t xml:space="preserve">Anderson</w:t>
       </w:r>
       <w:r>
-        <w:t xml:space="preserve">, the Court held that unlike Maryland’s only statute of repose, which speaks in terms of how long “a cause of action” existed after it “accrued,” Cts. &amp; Jud. Pro. § 5</w:t>
+        <w:t xml:space="preserve">, the Court held that unlike Maryland’s only statute of repose, which speaks in terms of how long “a cause of action” existed after it “accrued,” Cts. &amp; Jud. Pro. § 5-⁠108,</w:t>
+      </w:r>
+      <w:r>
+        <w:t xml:space="preserve"> </w:t>
+      </w:r>
+      <w:r>
+        <w:t xml:space="preserve">a statute that limited only how long a plaintiff had to “file” “an action for damages,” was a statute of limitations. 427 Md. at 107, 125</w:t>
       </w:r>
       <w:r>
         <w:noBreakHyphen/>
       </w:r>
       <w:r>
-        <w:t xml:space="preserve">108,</w:t>
-      </w:r>
-      <w:r>
-        <w:t xml:space="preserve"> </w:t>
-      </w:r>
-      <w:r>
-        <w:t xml:space="preserve">a statute that limited only how long a plaintiff had to “file” “an action for damages,” was a statute of limitations. 427 Md. at 107, 125</w:t>
-      </w:r>
-      <w:r>
-        <w:noBreakHyphen/>
-      </w:r>
-      <w:r>
         <w:t xml:space="preserve">26;</w:t>
       </w:r>
       <w:r>
@@ -10360,13 +10330,7 @@
         <w:t xml:space="preserve">Corp. v. Waldburger</w:t>
       </w:r>
       <w:r>
-        <w:t xml:space="preserve">, 573 U.S. 1, 16–17 (2014) (holding that a statute that referred to the period in which an “action” “may be brought” described a statute of limitations because it did not “define the scope of . . . liability”). The 2017 law used the same language: it limited only when an “action for damages . . . may be filed,” not when liability accrued or for how long it existed. Cts. &amp; Jud. Proc. § 5</w:t>
-      </w:r>
-      <w:r>
-        <w:noBreakHyphen/>
-      </w:r>
-      <w:r>
-        <w:t xml:space="preserve">117(d) (2017).</w:t>
+        <w:t xml:space="preserve">, 573 U.S. 1, 16–17 (2014) (holding that a statute that referred to the period in which an “action” “may be brought” described a statute of limitations because it did not “define the scope of . . . liability”). The 2017 law used the same language: it limited only when an “action for damages . . . may be filed,” not when liability accrued or for how long it existed. Cts. &amp; Jud. Proc. § 5-⁠117(d) (2017).</w:t>
       </w:r>
       <w:r>
         <w:t xml:space="preserve"> </w:t>
@@ -11129,7 +11093,7 @@
         <w:t xml:space="preserve">Anderson</w:t>
       </w:r>
       <w:r>
-        <w:t xml:space="preserve">, 427 Md. at 107, 127 (holding that statute that started the clock on the date of the injury or when “a minor . . . attained majority” was a statute of limitations). Put differently, tort statutes of limitations are generally “tolled,” or paused, until the minor can sue.</w:t>
+        <w:t xml:space="preserve">, 427 Md. at 107, 127 (holding that statute that started the clock on the date of the injury or when “a minor . . . attained majority” was a statute of limitations). Put differently, tort statutes of limitations are generally “tolled,” or paused, until the minor can sue.</w:t>
       </w:r>
       <w:r>
         <w:t xml:space="preserve"> </w:t>
@@ -11300,7 +11264,7 @@
         <w:t xml:space="preserve"> </w:t>
       </w:r>
       <w:r>
-        <w:t xml:space="preserve">c. 12, § 3—it introduced even more uncertainty: to know if the Act barred a given claim, the defendant would have to know if the claim was equitably tolled when the Act was passed.</w:t>
+        <w:t xml:space="preserve">c. 12, § 3—⁠it introduced even more uncertainty: to know if the Act barred a given claim, the defendant would have to know if the claim was equitably tolled when the Act was passed.</w:t>
       </w:r>
       <w:r>
         <w:t xml:space="preserve"> </w:t>
@@ -11954,7 +11918,7 @@
         <w:pStyle w:val="BodyText"/>
       </w:pPr>
       <w:r>
-        <w:t xml:space="preserve">The Constitution’s anti-retroactivity principles cut both ways: to the extent they protect a defendant’s right to be free from extinguished claims, they also preclude the “Legislature . . . from retroactively abolishing an accrued cause of action.”</w:t>
+        <w:t xml:space="preserve">The Constitution’s anti-retroactivity principles cut both ways: to the extent they protect a defendant’s right to be free from extinguished claims, they also preclude the “Legislature . . . from retroactively abolishing an accrued cause of action.”</w:t>
       </w:r>
       <w:r>
         <w:t xml:space="preserve"> </w:t>
@@ -12028,7 +11992,7 @@
         <w:t xml:space="preserve">See Johnson v. State</w:t>
       </w:r>
       <w:r>
-        <w:t xml:space="preserve">, 271 Md. 189, 195 (Ct. App. 1974) (“[A]n unconstitutional act . . . cannot confer any right.”). So the CVA took nothing to which Defendant was constitutionally entitled.</w:t>
+        <w:t xml:space="preserve">, 271 Md. 189, 195 (Ct. App. 1974) (“[A]n unconstitutional act . . . cannot confer any right.”). So the CVA took nothing to which Defendant was constitutionally entitled.</w:t>
       </w:r>
     </w:p>
     <w:p>
@@ -15157,7 +15121,7 @@
         <w:t xml:space="preserve"> </w:t>
       </w:r>
       <w:r>
-        <w:t xml:space="preserve">https://www.marylandattorneygeneral.gov/​reports/​AOB_Report_Revised_Redacted_Interim.pdf</w:t>
+        <w:t xml:space="preserve">https://​www.​marylandattorneygeneral.​gov/​reports/​AOB_Report_Revised_Redacted_Interim.​pdf</w:t>
       </w:r>
     </w:p>
   </w:footnote>
@@ -15361,7 +15325,7 @@
         <w:t xml:space="preserve"> </w:t>
       </w:r>
       <w:r>
-        <w:t xml:space="preserve">As Plaintiffs point out, the term “statute of repose” is itself ambiguous. Courts have often used it to “refer[ ] to all provisions delineating the time in which a plaintiff must bring suit.”</w:t>
+        <w:t xml:space="preserve">As Plaintiffs point out, the term “statute of repose” is itself ambiguous. Courts have often used it to “refer[ ] to all provisions delineating the time in which a plaintiff must bring suit.”</w:t>
       </w:r>
       <w:r>
         <w:t xml:space="preserve"> </w:t>
@@ -15594,7 +15558,7 @@
         <w:t xml:space="preserve"> </w:t>
       </w:r>
       <w:r>
-        <w:t xml:space="preserve">https://cdn.ymaws.com/​www.safestates.org/​resource/​resmgr/​policy/​FY_2019_CDC_RTC_on_Child_Sex.pdf.</w:t>
+        <w:t xml:space="preserve">https://​cdn.​ymaws.​com/​www.​safestates.​org/​resource/​resmgr/​policy/​FY_2019_CDC_RTC_on_Child_Sex.​pdf.</w:t>
       </w:r>
     </w:p>
   </w:footnote>
@@ -15613,7 +15577,7 @@
         <w:t xml:space="preserve"> </w:t>
       </w:r>
       <w:r>
-        <w:t xml:space="preserve">https://mcasa.org/​assets/​files/​Incidence_of_CSA_Fact_Sheet_2021.12.pdf.</w:t>
+        <w:t xml:space="preserve">https://​mcasa.​org/​assets/​files/​Incidence_of_CSA_Fact_Sheet_2021.​12.​pdf.</w:t>
       </w:r>
     </w:p>
   </w:footnote>
@@ -15632,7 +15596,7 @@
         <w:t xml:space="preserve"> </w:t>
       </w:r>
       <w:r>
-        <w:t xml:space="preserve">https://www.d2l.org/​wp-content/​uploads/2023/03/​Child-Sexual-Abuse-Updates.pdf.</w:t>
+        <w:t xml:space="preserve">https://​www.​d2l.​org/​wp-​content/​uploads/​2023/​03/​Child-​Sexual-​Abuse-​Updates.​pdf.</w:t>
       </w:r>
     </w:p>
   </w:footnote>
@@ -15651,7 +15615,7 @@
         <w:t xml:space="preserve"> </w:t>
       </w:r>
       <w:r>
-        <w:t xml:space="preserve">https://www.ojp.gov/​pdffiles/​victcost.pdf.</w:t>
+        <w:t xml:space="preserve">https://​www.​ojp.​gov/​pdffiles/​victcost.​pdf.</w:t>
       </w:r>
     </w:p>
   </w:footnote>
@@ -15670,13 +15634,13 @@
         <w:t xml:space="preserve"> </w:t>
       </w:r>
       <w:r>
-        <w:t xml:space="preserve">https://childusa.org/​wp-content/​uploads/2024/06/​Delayed-Disclosure</w:t>
+        <w:t xml:space="preserve">https://​childusa.​org/​wp-​content/​uploads/​2024/​06/​Delayed-​Disclosure</w:t>
       </w:r>
       <w:r>
         <w:noBreakHyphen/>
       </w:r>
       <w:r>
-        <w:t xml:space="preserve">2024.pdf.</w:t>
+        <w:t xml:space="preserve">2024.​pdf.</w:t>
       </w:r>
     </w:p>
   </w:footnote>
@@ -15695,7 +15659,7 @@
         <w:t xml:space="preserve"> </w:t>
       </w:r>
       <w:r>
-        <w:t xml:space="preserve">https://childusa.org/6</w:t>
+        <w:t xml:space="preserve">https://​childusa.​org/​6</w:t>
       </w:r>
       <w:r>
         <w:noBreakHyphen/>
@@ -15713,7 +15677,7 @@
         <w:noBreakHyphen/>
       </w:r>
       <w:r>
-        <w:t xml:space="preserve">2021-sol-report-final.</w:t>
+        <w:t xml:space="preserve">2021-​sol-​report-​final.</w:t>
       </w:r>
     </w:p>
   </w:footnote>
@@ -15732,7 +15696,7 @@
         <w:t xml:space="preserve"> </w:t>
       </w:r>
       <w:r>
-        <w:t xml:space="preserve">https://clergyreport.illinoisattorneygeneral.gov/​download/​report.pdf.</w:t>
+        <w:t xml:space="preserve">https://​clergyreport.​illinoisattorneygeneral.​gov/​download/​report.​pdf.</w:t>
       </w:r>
     </w:p>
   </w:footnote>
@@ -15751,7 +15715,7 @@
         <w:t xml:space="preserve"> </w:t>
       </w:r>
       <w:r>
-        <w:t xml:space="preserve">https://www.attorneygeneral.gov/​wp-content/​uploads/2023/05/​INVESTIGATING-GRAND-JURY-REPORT-NO.</w:t>
+        <w:t xml:space="preserve">https://​www.​attorneygeneral.​gov/​wp-​content/​uploads/​2023/​05/​INVESTIGATING-​GRAND-​JURY-​REPORT-​NO.</w:t>
       </w:r>
       <w:r>
         <w:noBreakHyphen/>
@@ -15763,7 +15727,7 @@
         <w:noBreakHyphen/>
       </w:r>
       <w:r>
-        <w:t xml:space="preserve">2023_Redacted.pdf.</w:t>
+        <w:t xml:space="preserve">2023_Redacted.​pdf.</w:t>
       </w:r>
     </w:p>
   </w:footnote>
@@ -15782,13 +15746,13 @@
         <w:t xml:space="preserve"> </w:t>
       </w:r>
       <w:r>
-        <w:t xml:space="preserve">https://oig.justice.gov/​sites/​default/​files/​reports/21</w:t>
+        <w:t xml:space="preserve">https://​oig.​justice.​gov/​sites/​default/​files/​reports/​21</w:t>
       </w:r>
       <w:r>
         <w:noBreakHyphen/>
       </w:r>
       <w:r>
-        <w:t xml:space="preserve">093.pdf.</w:t>
+        <w:t xml:space="preserve">093.​pdf.</w:t>
       </w:r>
     </w:p>
   </w:footnote>
@@ -15807,7 +15771,7 @@
         <w:t xml:space="preserve"> </w:t>
       </w:r>
       <w:r>
-        <w:t xml:space="preserve">https://media.pennlive.com/​midstate_impact/​other/​REPORT_FINAL_071212.pdf.</w:t>
+        <w:t xml:space="preserve">https://​media.​pennlive.​com/​midstate_impact/​other/​REPORT_FINAL_071212.​pdf.</w:t>
       </w:r>
     </w:p>
   </w:footnote>
@@ -15826,7 +15790,7 @@
         <w:t xml:space="preserve"> </w:t>
       </w:r>
       <w:r>
-        <w:t xml:space="preserve">https://childusa.org/​wp-content/​uploads/2023/11/​US-WindowsRevival-Laws-for-CSA-Since</w:t>
+        <w:t xml:space="preserve">https://​childusa.​org/​wp-​content/​uploads/​2023/​11/​US-​WindowsRevival-​Laws-​for-​CSA-​Since</w:t>
       </w:r>
       <w:r>
         <w:noBreakHyphen/>
@@ -15838,7 +15802,7 @@
         <w:noBreakHyphen/>
       </w:r>
       <w:r>
-        <w:t xml:space="preserve">11.1.23.pdf.</w:t>
+        <w:t xml:space="preserve">11.​1.​23.​pdf.</w:t>
       </w:r>
     </w:p>
   </w:footnote>
@@ -15857,7 +15821,7 @@
         <w:t xml:space="preserve"> </w:t>
       </w:r>
       <w:r>
-        <w:t xml:space="preserve">https://childusa.org/2024sol/.</w:t>
+        <w:t xml:space="preserve">https://​childusa.​org/​2024sol/​.</w:t>
       </w:r>
     </w:p>
   </w:footnote>
@@ -16853,6 +16817,7 @@
     <w:unhideWhenUsed/>
     <w:qFormat/>
     <w:pPr>
+      <w:keepLines/>
       <w:spacing w:before="0" w:after="140" w:line="299" w:lineRule="exact"/>
     </w:pPr>
     <w:rPr>
@@ -17103,6 +17068,33 @@
     <w:pPr>
       <w:spacing w:before="0" w:after="0" w:line="299" w:lineRule="exact"/>
       <w:ind w:left="2160" w:hanging="720"/>
+    </w:pPr>
+  </w:style>
+  <w:style w:type="paragraph" w:customStyle="1" w:styleId="XdQuoteList1">
+    <w:name w:val="Xd Quote List 1"/>
+    <w:basedOn w:val="Normal"/>
+    <w:qFormat/>
+    <w:pPr>
+      <w:spacing w:before="0" w:after="0" w:line="299" w:lineRule="exact"/>
+      <w:ind w:left="1440" w:right="720" w:hanging="720"/>
+    </w:pPr>
+  </w:style>
+  <w:style w:type="paragraph" w:customStyle="1" w:styleId="XdQuoteList2">
+    <w:name w:val="Xd Quote List 2"/>
+    <w:basedOn w:val="Normal"/>
+    <w:qFormat/>
+    <w:pPr>
+      <w:spacing w:before="0" w:after="0" w:line="299" w:lineRule="exact"/>
+      <w:ind w:left="2160" w:right="720" w:hanging="720"/>
+    </w:pPr>
+  </w:style>
+  <w:style w:type="paragraph" w:customStyle="1" w:styleId="XdQuoteList3">
+    <w:name w:val="Xd Quote List 3"/>
+    <w:basedOn w:val="Normal"/>
+    <w:qFormat/>
+    <w:pPr>
+      <w:spacing w:before="0" w:after="0" w:line="299" w:lineRule="exact"/>
+      <w:ind w:left="2880" w:right="720" w:hanging="720"/>
     </w:pPr>
   </w:style>
   <w:style w:type="paragraph" w:customStyle="1" w:styleId="SourceCode">

</xml_diff>